<commit_message>
docs(product-guide): v1.1 - stop claiming Sentientia is live (airpay.academy runs the legacy BizLMS; Sentientia is on UAT, Moodle 5.3 since 2026-10-21, and replaces it at cutover), UAT instead of 'staging', 32 ADRs (was 27), honest pipeline status (one sample SOP; orchestrator runs an older agent copy; packager fixes of 2026-10-22); md and docx regenerated together (research item 3; the generator in .tools/docgen is local and git-ignored)
Co-Authored-By: Claude Opus 5.5 <noreply@anthropic.com>
</commit_message>
<xml_diff>
--- a/moodle-enhancement/docs/SENTIENTIA-PRODUCT-GUIDE.docx
+++ b/moodle-enhancement/docs/SENTIENTIA-PRODUCT-GUIDE.docx
@@ -43,7 +43,7 @@
           <w:sz w:val="19"/>
           <w:szCs w:val="19"/>
         </w:rPr>
-        <w:t xml:space="preserve">For the Airpay founder &amp; C-suite · Prepared by Nitin Rajput, Head of L&amp;D · 10 June 2026 · v1.0</w:t>
+        <w:t xml:space="preserve">For the Airpay founder &amp; C-suite · Prepared by Nitin Rajput, Head of L&amp;D · 10 June 2026 · v1.1 (updated 22 October 2026)</w:t>
       </w:r>
     </w:p>
     <w:p>
@@ -115,13 +115,13 @@
           <w:bCs/>
           <w:color w:val="1A1A2E"/>
         </w:rPr>
-        <w:t xml:space="preserve">Live in production</w:t>
-      </w:r>
-      <w:r>
-        <w:rPr>
-          <w:color w:val="1A1A2E"/>
-        </w:rPr>
-        <w:t xml:space="preserve"> at airpay.academy serving 3,500+ learners across 3 business units (Airpay internal, Public/consumer, ZEEA Tanzania) — compliance training, exams, certifications, deadline enforcement and manager escalations run on it daily.</w:t>
+        <w:t xml:space="preserve">Customer-zero today:</w:t>
+      </w:r>
+      <w:r>
+        <w:rPr>
+          <w:color w:val="1A1A2E"/>
+        </w:rPr>
+        <w:t xml:space="preserve"> airpay.academy still runs the legacy BizLMS platform, serving 3,500+ learners across 3 business units (Airpay internal, Public/consumer, ZEEA Tanzania). Sentientia is not live yet: it runs on the UAT server (Moodle 5.3 LTS since 21 October 2026) and replaces BizLMS at the cutover, after a rehearsal on a fresh live backup.</w:t>
       </w:r>
     </w:p>
     <w:p>
@@ -139,7 +139,7 @@
           <w:bCs/>
           <w:color w:val="1A1A2E"/>
         </w:rPr>
-        <w:t xml:space="preserve">The product layer is complete and verified on staging</w:t>
+        <w:t xml:space="preserve">The product layer is complete and verified on test copies and UAT</w:t>
       </w:r>
       <w:r>
         <w:rPr>
@@ -1385,7 +1385,7 @@
               <w:rPr>
                 <w:color w:val="1A1A2E"/>
               </w:rPr>
-              <w:t xml:space="preserve">Moodle 5.1.3 open core, PHP 8.3, MySQL/MariaDB; Moodle 5.3 LTS is the next platform target (security support to October 2029): the compatibility fixes are code-complete and its validation gate is still to run; the Moodle 5.2 upgrade was rehearsed and remains the fallback</w:t>
+              <w:t xml:space="preserve">Moodle 5.1.3 open core, PHP 8.3, MySQL/MariaDB; Moodle 5.2 upgrade rehearsed and code-complete, cutover at our discretion</w:t>
             </w:r>
           </w:p>
         </w:tc>
@@ -1555,7 +1555,7 @@
         <w:rPr>
           <w:color w:val="1A1A2E"/>
         </w:rPr>
-        <w:t xml:space="preserve">The SENTIENTIA content pipeline turns an SOP PDF into a SCORM course through six agents: parse → narration → slides → AI voice-over → SCORM package → upload. Built and tested end-to-end in mock/local mode; voice cost is confirm-gated so spend is always deliberate. AI features (quiz generation with 4-layer cost defence, role-aware assistant, translation queue) are demoable today in mock mode and activate fully when we provision an Anthropic API key.</w:t>
+        <w:t xml:space="preserve">The SENTIENTIA content pipeline turns an SOP PDF into a SCORM course through six agents: parse → narration → slides → AI voice-over → SCORM package → upload. Built and tested in mock/local mode on one sample SOP (the orchestrator still runs an older copy of the agents, being consolidated in October 2026; the SCORM packager’s resume and completion bugs were fixed on 22 October 2026); voice cost is confirm-gated so spend is always deliberate. AI features (quiz generation with 4-layer cost defence, role-aware assistant, translation queue) are demoable today in mock mode and activate fully when we provision an Anthropic API key.</w:t>
       </w:r>
     </w:p>
     <w:p>
@@ -1835,7 +1835,7 @@
         <w:rPr>
           <w:color w:val="1A1A2E"/>
         </w:rPr>
-        <w:t xml:space="preserve"> — 27 ADRs, per-plugin state cards, CI on every push, and visual evidence required for every UI change.</w:t>
+        <w:t xml:space="preserve"> — 32 ADRs (ADR-001 to ADR-034), per-plugin state cards, CI on every push, and visual evidence required for every UI change.</w:t>
       </w:r>
     </w:p>
     <w:p>
@@ -1992,7 +1992,7 @@
               <w:rPr>
                 <w:color w:val="1A1A2E"/>
               </w:rPr>
-              <w:t xml:space="preserve">LIVE on airpay.academy</w:t>
+              <w:t xml:space="preserve">LIVE on airpay.academy (legacy BizLMS)</w:t>
             </w:r>
           </w:p>
         </w:tc>
@@ -2048,7 +2048,7 @@
               <w:rPr>
                 <w:color w:val="1A1A2E"/>
               </w:rPr>
-              <w:t xml:space="preserve">Serving 3,500+ users now (the pre-product-layer deployment)</w:t>
+              <w:t xml:space="preserve">Serving 3,500+ users now; Sentientia replaces it at cutover</w:t>
             </w:r>
           </w:p>
         </w:tc>
@@ -2259,7 +2259,7 @@
         <w:rPr>
           <w:color w:val="1A1A2E"/>
         </w:rPr>
-        <w:t xml:space="preserve">This quarter’s work is committed, pushed and staging-verified but not deployed to the live server. Deploy automation and a turnkey cutover runbook exist. </w:t>
+        <w:t xml:space="preserve">This quarter’s work is committed, pushed and verified on test copies and UAT but not deployed to the live server. Deploy automation and a turnkey cutover runbook exist. </w:t>
       </w:r>
       <w:r>
         <w:rPr>
@@ -2350,7 +2350,7 @@
         <w:rPr>
           <w:color w:val="1A1A2E"/>
         </w:rPr>
-        <w:t xml:space="preserve">Pick the Moodle 5.3 cutover window once its validation gate has passed (the 5.2 upgrade is rehearsed and remains the fallback; the platform keeps its current Moodle release until we choose).</w:t>
+        <w:t xml:space="preserve">Pick the Moodle 5.2 cutover window (the upgrade is rehearsed; production stays on 5.1 until we choose).</w:t>
       </w:r>
     </w:p>
     <w:p>
@@ -2660,7 +2660,7 @@
               <w:rPr>
                 <w:color w:val="1A1A2E"/>
               </w:rPr>
-              <w:t xml:space="preserve">AI live mode + content pipeline GA (keys/budget); Moodle 5.3 cutover (after its validation gate); app-shell completion; mobile wrapper decision (the PWA is live — wrappers add app-store presence)</w:t>
+              <w:t xml:space="preserve">AI live mode + content pipeline GA (keys/budget); Moodle 5.2 cutover; app-shell completion; mobile wrapper decision (the PWA is live — wrappers add app-store presence)</w:t>
             </w:r>
           </w:p>
         </w:tc>
@@ -3254,7 +3254,7 @@
           <w:sz w:val="18"/>
           <w:szCs w:val="18"/>
         </w:rPr>
-        <w:t xml:space="preserve">Prepared from the live engineering record (PROJECT-STATE, ADRs, audits) as of 10 June 2026. Numbers are from the May-2026 production snapshot and the June-2026 capability audit.</w:t>
+        <w:t xml:space="preserve">Prepared from the live engineering record (PROJECT-STATE, ADRs, audits) as of 10 June 2026. Numbers are from the May-2026 production snapshot and the June-2026 capability audit. Updated 22 October 2026: live and UAT status, ADR count, pipeline status.</w:t>
       </w:r>
     </w:p>
     <w:sectPr>

</xml_diff>